<commit_message>
Address UI library audit review feedback
</commit_message>
<xml_diff>
--- a/docs/FE-T2-03_UI_Library_Audit.docx
+++ b/docs/FE-T2-03_UI_Library_Audit.docx
@@ -149,13 +149,8 @@
         <w:t xml:space="preserve"> </w:t>
       </w:r>
       <w:r>
-        <w:t xml:space="preserve">Thisarani Upayangika </w:t>
-      </w:r>
-      <w:proofErr w:type="spellStart"/>
-      <w:r>
-        <w:t>Uggallage</w:t>
-      </w:r>
-      <w:proofErr w:type="spellEnd"/>
+        <w:t>Thisarani Upayangika Uggallage</w:t>
+      </w:r>
     </w:p>
     <w:p>
       <w:pPr>
@@ -311,11 +306,9 @@
       <w:r>
         <w:t xml:space="preserve">.. </w:t>
       </w:r>
-      <w:proofErr w:type="gramStart"/>
       <w:r>
         <w:t>4</w:t>
       </w:r>
-      <w:proofErr w:type="gramEnd"/>
     </w:p>
     <w:p>
       <w:pPr>
@@ -371,11 +364,9 @@
       <w:r>
         <w:t xml:space="preserve">. </w:t>
       </w:r>
-      <w:proofErr w:type="gramStart"/>
       <w:r>
         <w:t>9</w:t>
       </w:r>
-      <w:proofErr w:type="gramEnd"/>
     </w:p>
     <w:p>
       <w:pPr>
@@ -424,14 +415,12 @@
       <w:r>
         <w:t>..</w:t>
       </w:r>
-      <w:proofErr w:type="gramStart"/>
       <w:r>
         <w:t>1</w:t>
       </w:r>
       <w:r>
         <w:t>5</w:t>
       </w:r>
-      <w:proofErr w:type="gramEnd"/>
     </w:p>
     <w:p>
       <w:pPr>
@@ -516,10 +505,10 @@
         <w:t xml:space="preserve"> ................................ 1</w:t>
       </w:r>
       <w:r>
-        <w:t>6-1</w:t>
-      </w:r>
-      <w:r>
-        <w:t>9</w:t>
+        <w:t>6-</w:t>
+      </w:r>
+      <w:r>
+        <w:t>20</w:t>
       </w:r>
     </w:p>
     <w:p>
@@ -549,44 +538,40 @@
       <w:r>
         <w:t xml:space="preserve">..... </w:t>
       </w:r>
-      <w:proofErr w:type="gramStart"/>
+      <w:r>
+        <w:t>20</w:t>
+      </w:r>
+    </w:p>
+    <w:p>
+      <w:pPr>
+        <w:spacing w:after="0"/>
+      </w:pPr>
+    </w:p>
+    <w:p>
+      <w:pPr>
+        <w:spacing w:after="0"/>
+      </w:pPr>
+      <w:r>
+        <w:t>References .............................................................</w:t>
+      </w:r>
+      <w:r>
+        <w:t>.</w:t>
+      </w:r>
+      <w:r>
+        <w:t>..............</w:t>
+      </w:r>
+      <w:r>
+        <w:t>.</w:t>
+      </w:r>
+      <w:r>
+        <w:t xml:space="preserve">............. </w:t>
+      </w:r>
+      <w:r>
+        <w:t>2</w:t>
+      </w:r>
       <w:r>
         <w:t>1</w:t>
       </w:r>
-      <w:r>
-        <w:t>9</w:t>
-      </w:r>
-      <w:proofErr w:type="gramEnd"/>
-    </w:p>
-    <w:p>
-      <w:pPr>
-        <w:spacing w:after="0"/>
-      </w:pPr>
-    </w:p>
-    <w:p>
-      <w:pPr>
-        <w:spacing w:after="0"/>
-      </w:pPr>
-      <w:r>
-        <w:t>References .............................................................</w:t>
-      </w:r>
-      <w:r>
-        <w:t>.</w:t>
-      </w:r>
-      <w:r>
-        <w:t>..............</w:t>
-      </w:r>
-      <w:r>
-        <w:t>.</w:t>
-      </w:r>
-      <w:r>
-        <w:t xml:space="preserve">............. </w:t>
-      </w:r>
-      <w:proofErr w:type="gramStart"/>
-      <w:r>
-        <w:t>20</w:t>
-      </w:r>
-      <w:proofErr w:type="gramEnd"/>
     </w:p>
     <w:p>
       <w:pPr>
@@ -626,36 +611,12 @@
     </w:p>
     <w:p>
       <w:r>
-        <w:t xml:space="preserve">The frontend application currently makes use of </w:t>
-      </w:r>
-      <w:proofErr w:type="gramStart"/>
-      <w:r>
-        <w:t>a number of</w:t>
-      </w:r>
-      <w:proofErr w:type="gramEnd"/>
-      <w:r>
-        <w:t xml:space="preserve"> UI libraries, such as Material UI (MUI) and Semantic UI. Although </w:t>
-      </w:r>
-      <w:proofErr w:type="gramStart"/>
-      <w:r>
-        <w:t>both of these</w:t>
-      </w:r>
-      <w:proofErr w:type="gramEnd"/>
-      <w:r>
-        <w:t xml:space="preserve"> libraries offer reusable interface components, the fact that multiple UI libraries are employed increases the complexity of development, leads to inconsistencies in the user interface, and makes future maintenance more difficult.</w:t>
-      </w:r>
-    </w:p>
-    <w:p>
-      <w:r>
-        <w:t xml:space="preserve">The audit covers all the present use of Material UI and Semantic UI components in the project and establishes a migration plan with the aim of </w:t>
-      </w:r>
-      <w:proofErr w:type="spellStart"/>
-      <w:r>
-        <w:t>standardising</w:t>
-      </w:r>
-      <w:proofErr w:type="spellEnd"/>
-      <w:r>
-        <w:t xml:space="preserve"> the frontend on Ant Design. The task consists solely of conducting the analysis and preparing the plan; it includes no actual code changes. (Gopher Industries, 2026).</w:t>
+        <w:t>The frontend application currently makes use of a number of UI libraries, such as Material UI (MUI) and Semantic UI. Although both of these libraries offer reusable interface components, the fact that multiple UI libraries are employed increases the complexity of development, leads to inconsistencies in the user interface, and makes future maintenance more difficult.</w:t>
+      </w:r>
+    </w:p>
+    <w:p>
+      <w:r>
+        <w:t>The audit covers all the present use of Material UI and Semantic UI components in the project and establishes a migration plan with the aim of standardising the frontend on Ant Design. The task consists solely of conducting the analysis and preparing the plan; it includes no actual code changes. (Gopher Industries, 2026).</w:t>
       </w:r>
     </w:p>
     <w:p>
@@ -679,44 +640,12 @@
     </w:p>
     <w:p>
       <w:r>
-        <w:t xml:space="preserve">This task was intended to audit the frontend part of the </w:t>
-      </w:r>
-      <w:proofErr w:type="spellStart"/>
-      <w:r>
-        <w:t>NutriHelp</w:t>
-      </w:r>
-      <w:proofErr w:type="spellEnd"/>
-      <w:r>
-        <w:t xml:space="preserve"> application in order to find all the Material UI and Semantic UI React components that are currently in use in the project, and it also sought to estimate the amount of effort needed to replace those components with Ant Design as well as to identify any possible problems that might arise during the migration.</w:t>
-      </w:r>
-    </w:p>
-    <w:p>
-      <w:r>
-        <w:t xml:space="preserve">A concrete and well-defined plan </w:t>
-      </w:r>
-      <w:proofErr w:type="gramStart"/>
-      <w:r>
-        <w:t>is needed</w:t>
-      </w:r>
-      <w:proofErr w:type="gramEnd"/>
-      <w:r>
-        <w:t xml:space="preserve"> to consolidate the </w:t>
-      </w:r>
-      <w:proofErr w:type="spellStart"/>
-      <w:r>
-        <w:t>NutriHelp</w:t>
-      </w:r>
-      <w:proofErr w:type="spellEnd"/>
-      <w:r>
-        <w:t xml:space="preserve"> frontend onto a single UI library with the FE-T2-03 ticket. This ticket includes the audit and planning phases only and does not involve any code migration during Sprint 1 (</w:t>
-      </w:r>
-      <w:proofErr w:type="spellStart"/>
-      <w:r>
-        <w:t>NutriHelp</w:t>
-      </w:r>
-      <w:proofErr w:type="spellEnd"/>
-      <w:r>
-        <w:t xml:space="preserve"> Frontend Team, 2026).</w:t>
+        <w:t>This task was intended to audit the frontend part of the NutriHelp application in order to find all the Material UI and Semantic UI React components that are currently in use in the project, and it also sought to estimate the amount of effort needed to replace those components with Ant Design as well as to identify any possible problems that might arise during the migration.</w:t>
+      </w:r>
+    </w:p>
+    <w:p>
+      <w:r>
+        <w:t>A concrete and well-defined plan is needed to consolidate the NutriHelp frontend onto a single UI library with the FE-T2-03 ticket. This ticket includes the audit and planning phases only and does not involve any code migration during Sprint 1 (NutriHelp Frontend Team, 2026).</w:t>
       </w:r>
     </w:p>
     <w:p>
@@ -791,65 +720,17 @@
     </w:p>
     <w:p>
       <w:r>
-        <w:t xml:space="preserve">The initial </w:t>
-      </w:r>
-      <w:proofErr w:type="spellStart"/>
-      <w:r>
-        <w:t>synchronisation</w:t>
-      </w:r>
-      <w:proofErr w:type="spellEnd"/>
-      <w:r>
-        <w:t xml:space="preserve"> of the project with the most up-to-date version of the master branch </w:t>
-      </w:r>
-      <w:proofErr w:type="gramStart"/>
-      <w:r>
-        <w:t>was conducted</w:t>
-      </w:r>
-      <w:proofErr w:type="gramEnd"/>
-      <w:r>
-        <w:t xml:space="preserve"> using Git in order that the audit might </w:t>
-      </w:r>
-      <w:proofErr w:type="gramStart"/>
-      <w:r>
-        <w:t>be completed</w:t>
-      </w:r>
-      <w:proofErr w:type="gramEnd"/>
-      <w:r>
-        <w:t xml:space="preserve"> on the most recent source code.</w:t>
-      </w:r>
-    </w:p>
-    <w:p>
-      <w:r>
-        <w:t xml:space="preserve">To locate all the imports of Material UI and Semantic UI React within the </w:t>
-      </w:r>
-      <w:proofErr w:type="spellStart"/>
-      <w:r>
-        <w:t>src</w:t>
-      </w:r>
-      <w:proofErr w:type="spellEnd"/>
-      <w:r>
-        <w:t xml:space="preserve"> directory, the global search feature of Visual Studio Code </w:t>
-      </w:r>
-      <w:proofErr w:type="gramStart"/>
-      <w:r>
-        <w:t>was used</w:t>
-      </w:r>
-      <w:proofErr w:type="gramEnd"/>
-      <w:r>
-        <w:t>.</w:t>
-      </w:r>
-    </w:p>
-    <w:p>
-      <w:r>
-        <w:t xml:space="preserve">The following research was </w:t>
-      </w:r>
-      <w:proofErr w:type="gramStart"/>
-      <w:r>
-        <w:t>carried out</w:t>
-      </w:r>
-      <w:proofErr w:type="gramEnd"/>
-      <w:r>
-        <w:t>:</w:t>
+        <w:t>The initial synchronisation of the project with the most up-to-date version of the master branch was conducted using Git in order that the audit might be completed on the most recent source code.</w:t>
+      </w:r>
+    </w:p>
+    <w:p>
+      <w:r>
+        <w:t>To locate all the imports of Material UI and Semantic UI React within the src directory, the global search feature of Visual Studio Code was used.</w:t>
+      </w:r>
+    </w:p>
+    <w:p>
+      <w:r>
+        <w:t>The following research was carried out:</w:t>
       </w:r>
     </w:p>
     <w:p>
@@ -867,63 +748,18 @@
       </w:r>
       <w:r>
         <w:tab/>
-        <w:t>semantic-</w:t>
-      </w:r>
-      <w:proofErr w:type="spellStart"/>
-      <w:r>
-        <w:t>ui</w:t>
-      </w:r>
-      <w:proofErr w:type="spellEnd"/>
-      <w:r>
-        <w:t xml:space="preserve">-react </w:t>
-      </w:r>
-    </w:p>
-    <w:p>
-      <w:r>
-        <w:t xml:space="preserve">Each of the matching files </w:t>
-      </w:r>
-      <w:proofErr w:type="gramStart"/>
-      <w:r>
-        <w:t>was opened</w:t>
-      </w:r>
-      <w:proofErr w:type="gramEnd"/>
-      <w:r>
-        <w:t xml:space="preserve"> and examined separately to identify the components that had </w:t>
-      </w:r>
-      <w:proofErr w:type="gramStart"/>
-      <w:r>
-        <w:t>been imported</w:t>
-      </w:r>
-      <w:proofErr w:type="gramEnd"/>
-      <w:r>
-        <w:t xml:space="preserve"> and to understand how they were </w:t>
-      </w:r>
-      <w:proofErr w:type="gramStart"/>
-      <w:r>
-        <w:t>being used</w:t>
-      </w:r>
-      <w:proofErr w:type="gramEnd"/>
-      <w:r>
-        <w:t>.</w:t>
-      </w:r>
-    </w:p>
-    <w:p>
-      <w:r>
-        <w:t xml:space="preserve">Finally, the installed Ant Design version </w:t>
-      </w:r>
-      <w:proofErr w:type="gramStart"/>
-      <w:r>
-        <w:t>was verified</w:t>
-      </w:r>
-      <w:proofErr w:type="gramEnd"/>
-      <w:r>
-        <w:t xml:space="preserve"> using </w:t>
-      </w:r>
-      <w:proofErr w:type="spellStart"/>
-      <w:r>
-        <w:t>npm</w:t>
-      </w:r>
-      <w:proofErr w:type="spellEnd"/>
+        <w:t xml:space="preserve">semantic-ui-react </w:t>
+      </w:r>
+    </w:p>
+    <w:p>
+      <w:r>
+        <w:t>Each of the matching files was opened and examined separately to identify the components that had been imported and to understand how they were being used.</w:t>
+      </w:r>
+    </w:p>
+    <w:p>
+      <w:r>
+        <w:t>Finally, the installed Ant Design version was verified using npm</w:t>
+      </w:r>
       <w:r>
         <w:t>.</w:t>
       </w:r>
@@ -1106,15 +942,7 @@
         <w:t>Figure 1.</w:t>
       </w:r>
       <w:r>
-        <w:t xml:space="preserve"> Git repository </w:t>
-      </w:r>
-      <w:proofErr w:type="spellStart"/>
-      <w:r>
-        <w:t>synchronised</w:t>
-      </w:r>
-      <w:proofErr w:type="spellEnd"/>
-      <w:r>
-        <w:t xml:space="preserve"> with the latest master branch before beginning the audit.</w:t>
+        <w:t xml:space="preserve"> Git repository synchronised with the latest master branch before beginning the audit.</w:t>
       </w:r>
     </w:p>
     <w:p/>
@@ -1397,15 +1225,7 @@
     </w:p>
     <w:p>
       <w:r>
-        <w:t xml:space="preserve">Only one Material UI component </w:t>
-      </w:r>
-      <w:proofErr w:type="gramStart"/>
-      <w:r>
-        <w:t>was found</w:t>
-      </w:r>
-      <w:proofErr w:type="gramEnd"/>
-      <w:r>
-        <w:t>.</w:t>
+        <w:t>Only one Material UI component was found.</w:t>
       </w:r>
     </w:p>
     <w:tbl>
@@ -1497,13 +1317,8 @@
             <w:pPr>
               <w:spacing w:after="160" w:line="278" w:lineRule="auto"/>
             </w:pPr>
-            <w:proofErr w:type="spellStart"/>
-            <w:r>
-              <w:t>src</w:t>
-            </w:r>
-            <w:proofErr w:type="spellEnd"/>
-            <w:r>
-              <w:t>/routes/Settings/Settings.js</w:t>
+            <w:r>
+              <w:t>src/routes/Settings/Settings.js</w:t>
             </w:r>
           </w:p>
         </w:tc>
@@ -1540,47 +1355,7 @@
     <w:p/>
     <w:p>
       <w:r>
-        <w:t xml:space="preserve">The Slider component is </w:t>
-      </w:r>
-      <w:proofErr w:type="spellStart"/>
-      <w:r>
-        <w:t>customised</w:t>
-      </w:r>
-      <w:proofErr w:type="spellEnd"/>
-      <w:r>
-        <w:t xml:space="preserve"> with styling and additional properties such as minimum value, maximum value, step </w:t>
-      </w:r>
-      <w:proofErr w:type="gramStart"/>
-      <w:r>
-        <w:t>size</w:t>
-      </w:r>
-      <w:proofErr w:type="gramEnd"/>
-      <w:r>
-        <w:t xml:space="preserve"> and value labels. Because of these </w:t>
-      </w:r>
-      <w:proofErr w:type="spellStart"/>
-      <w:r>
-        <w:t>customisations</w:t>
-      </w:r>
-      <w:proofErr w:type="spellEnd"/>
-      <w:r>
-        <w:t xml:space="preserve">, replacing it with the Ant Design Slider will require </w:t>
-      </w:r>
-      <w:proofErr w:type="gramStart"/>
-      <w:r>
-        <w:t>some</w:t>
-      </w:r>
-      <w:proofErr w:type="gramEnd"/>
-      <w:r>
-        <w:t xml:space="preserve"> styling adjustments, although the migration complexity </w:t>
-      </w:r>
-      <w:proofErr w:type="gramStart"/>
-      <w:r>
-        <w:t>is considered</w:t>
-      </w:r>
-      <w:proofErr w:type="gramEnd"/>
-      <w:r>
-        <w:t xml:space="preserve"> moderate.</w:t>
+        <w:t>The Slider component is customised with styling and additional properties such as minimum value, maximum value, step size and value labels. Because of these customisations, replacing it with the Ant Design Slider will require some styling adjustments, although the migration complexity is considered moderate.</w:t>
       </w:r>
     </w:p>
     <w:p>
@@ -1797,11 +1572,9 @@
             <w:pPr>
               <w:spacing w:after="160" w:line="278" w:lineRule="auto"/>
             </w:pPr>
-            <w:proofErr w:type="spellStart"/>
             <w:r>
               <w:t>Fields.jsx</w:t>
             </w:r>
-            <w:proofErr w:type="spellEnd"/>
           </w:p>
         </w:tc>
         <w:tc>
@@ -1843,11 +1616,9 @@
             <w:pPr>
               <w:spacing w:after="160" w:line="278" w:lineRule="auto"/>
             </w:pPr>
-            <w:proofErr w:type="spellStart"/>
             <w:r>
               <w:t>Inputs.jsx</w:t>
             </w:r>
-            <w:proofErr w:type="spellEnd"/>
           </w:p>
         </w:tc>
         <w:tc>
@@ -1889,11 +1660,9 @@
             <w:pPr>
               <w:spacing w:after="160" w:line="278" w:lineRule="auto"/>
             </w:pPr>
-            <w:proofErr w:type="spellStart"/>
             <w:r>
               <w:t>SectionHeader.jsx</w:t>
             </w:r>
-            <w:proofErr w:type="spellEnd"/>
           </w:p>
         </w:tc>
         <w:tc>
@@ -1935,11 +1704,9 @@
             <w:pPr>
               <w:spacing w:after="160" w:line="278" w:lineRule="auto"/>
             </w:pPr>
-            <w:proofErr w:type="spellStart"/>
             <w:r>
               <w:t>SectionIngredients.jsx</w:t>
             </w:r>
-            <w:proofErr w:type="spellEnd"/>
           </w:p>
         </w:tc>
         <w:tc>
@@ -1981,11 +1748,9 @@
             <w:pPr>
               <w:spacing w:after="160" w:line="278" w:lineRule="auto"/>
             </w:pPr>
-            <w:proofErr w:type="spellStart"/>
             <w:r>
               <w:t>RecipeCardExtension.jsx</w:t>
             </w:r>
-            <w:proofErr w:type="spellEnd"/>
           </w:p>
         </w:tc>
         <w:tc>
@@ -1998,23 +1763,7 @@
               <w:spacing w:after="160" w:line="278" w:lineRule="auto"/>
             </w:pPr>
             <w:r>
-              <w:t xml:space="preserve">Grid, </w:t>
-            </w:r>
-            <w:proofErr w:type="spellStart"/>
-            <w:r>
-              <w:t>GridRow</w:t>
-            </w:r>
-            <w:proofErr w:type="spellEnd"/>
-            <w:r>
-              <w:t xml:space="preserve">, </w:t>
-            </w:r>
-            <w:proofErr w:type="spellStart"/>
-            <w:r>
-              <w:t>GridColumn</w:t>
-            </w:r>
-            <w:proofErr w:type="spellEnd"/>
-            <w:r>
-              <w:t>, Icon, Image</w:t>
+              <w:t>Grid, GridRow, GridColumn, Icon, Image</w:t>
             </w:r>
           </w:p>
         </w:tc>
@@ -2037,36 +1786,15 @@
     <w:p/>
     <w:p>
       <w:r>
-        <w:t xml:space="preserve">Most files only have a Button or Header component, which makes </w:t>
-      </w:r>
-      <w:proofErr w:type="gramStart"/>
-      <w:r>
-        <w:t>the migration</w:t>
-      </w:r>
-      <w:proofErr w:type="gramEnd"/>
-      <w:r>
-        <w:t xml:space="preserve"> easy.</w:t>
-      </w:r>
-    </w:p>
-    <w:p>
-      <w:r>
-        <w:t xml:space="preserve">The file </w:t>
-      </w:r>
-      <w:proofErr w:type="spellStart"/>
-      <w:r>
-        <w:t>RecipeCardExtension.jsx</w:t>
-      </w:r>
-      <w:proofErr w:type="spellEnd"/>
-      <w:r>
-        <w:t xml:space="preserve"> has layout components and icons that are </w:t>
-      </w:r>
-      <w:proofErr w:type="gramStart"/>
-      <w:r>
-        <w:t>very connected,</w:t>
-      </w:r>
-      <w:proofErr w:type="gramEnd"/>
-      <w:r>
-        <w:t xml:space="preserve"> to the page layout. This file will need testing after the migration.</w:t>
+        <w:t>Most files only have a Button or Header component, which makes the migration easy.</w:t>
+      </w:r>
+    </w:p>
+    <w:p>
+      <w:r>
+        <w:t xml:space="preserve">The file RecipeCardExtension.jsx has layout components and icons that are very connected, to the page layout. </w:t>
+      </w:r>
+      <w:r>
+        <w:t>The RecipeCardExtension.jsx file has a higher migration risk because its layout and visual components are closely connected. A review of the frontend source found no dedicated automated test file for this component. Therefore, Sprint 2 should include creating appropriate component tests for RecipeCardExtension.jsx, in addition to regression testing after the migration.</w:t>
       </w:r>
     </w:p>
     <w:p/>
@@ -2091,7 +1819,6 @@
           <w:b/>
           <w:bCs/>
         </w:rPr>
-        <w:lastRenderedPageBreak/>
         <w:t>Evidence</w:t>
       </w:r>
     </w:p>
@@ -2165,15 +1892,7 @@
         <w:t>Figure 5.</w:t>
       </w:r>
       <w:r>
-        <w:t xml:space="preserve"> Button component used in </w:t>
-      </w:r>
-      <w:proofErr w:type="spellStart"/>
-      <w:r>
-        <w:t>Fields.jsx</w:t>
-      </w:r>
-      <w:proofErr w:type="spellEnd"/>
-      <w:r>
-        <w:t>.</w:t>
+        <w:t xml:space="preserve"> Button component used in Fields.jsx.</w:t>
       </w:r>
     </w:p>
     <w:p>
@@ -2241,15 +1960,7 @@
         <w:t>Figure 6.</w:t>
       </w:r>
       <w:r>
-        <w:t xml:space="preserve"> Button component used in </w:t>
-      </w:r>
-      <w:proofErr w:type="spellStart"/>
-      <w:r>
-        <w:t>Inputs.jsx</w:t>
-      </w:r>
-      <w:proofErr w:type="spellEnd"/>
-      <w:r>
-        <w:t>.</w:t>
+        <w:t xml:space="preserve"> Button component used in Inputs.jsx.</w:t>
       </w:r>
     </w:p>
     <w:p/>
@@ -2316,15 +2027,7 @@
         <w:t>Figure 7.</w:t>
       </w:r>
       <w:r>
-        <w:t xml:space="preserve"> Header component used in </w:t>
-      </w:r>
-      <w:proofErr w:type="spellStart"/>
-      <w:r>
-        <w:t>SectionHeader.jsx</w:t>
-      </w:r>
-      <w:proofErr w:type="spellEnd"/>
-      <w:r>
-        <w:t>.</w:t>
+        <w:t xml:space="preserve"> Header component used in SectionHeader.jsx.</w:t>
       </w:r>
     </w:p>
     <w:p>
@@ -2333,7 +2036,7 @@
           <w:noProof/>
         </w:rPr>
         <w:drawing>
-          <wp:inline distT="0" distB="0" distL="0" distR="0" wp14:anchorId="70946836" wp14:editId="293E8BA7">
+          <wp:inline distT="0" distB="0" distL="0" distR="0" wp14:anchorId="70946836" wp14:editId="311D2422">
             <wp:extent cx="5943600" cy="3431540"/>
             <wp:effectExtent l="0" t="0" r="0" b="0"/>
             <wp:docPr id="21099594" name="Picture 11"/>
@@ -2391,15 +2094,7 @@
         <w:t>Figure 8.</w:t>
       </w:r>
       <w:r>
-        <w:t xml:space="preserve"> Button component used in </w:t>
-      </w:r>
-      <w:proofErr w:type="spellStart"/>
-      <w:r>
-        <w:t>SectionIngredients.jsx</w:t>
-      </w:r>
-      <w:proofErr w:type="spellEnd"/>
-      <w:r>
-        <w:t>.</w:t>
+        <w:t xml:space="preserve"> Button component used in SectionIngredients.jsx.</w:t>
       </w:r>
     </w:p>
     <w:p>
@@ -2416,7 +2111,7 @@
         </w:rPr>
         <w:lastRenderedPageBreak/>
         <w:drawing>
-          <wp:inline distT="0" distB="0" distL="0" distR="0" wp14:anchorId="295F0BBE" wp14:editId="4E8A4324">
+          <wp:inline distT="0" distB="0" distL="0" distR="0" wp14:anchorId="295F0BBE" wp14:editId="62C816BC">
             <wp:extent cx="6568402" cy="3918585"/>
             <wp:effectExtent l="0" t="0" r="4445" b="5715"/>
             <wp:docPr id="181385292" name="Picture 12"/>
@@ -2472,15 +2167,7 @@
         <w:t>Figure 9.</w:t>
       </w:r>
       <w:r>
-        <w:t xml:space="preserve"> Multiple Semantic UI React components used in </w:t>
-      </w:r>
-      <w:proofErr w:type="spellStart"/>
-      <w:r>
-        <w:t>RecipeCardExtension.jsx</w:t>
-      </w:r>
-      <w:proofErr w:type="spellEnd"/>
-      <w:r>
-        <w:t>.</w:t>
+        <w:t xml:space="preserve"> Multiple Semantic UI React components used in RecipeCardExtension.jsx.</w:t>
       </w:r>
     </w:p>
     <w:p/>
@@ -2771,13 +2458,8 @@
             <w:pPr>
               <w:spacing w:after="160" w:line="278" w:lineRule="auto"/>
             </w:pPr>
-            <w:proofErr w:type="gramStart"/>
-            <w:r>
-              <w:t>@emotion</w:t>
-            </w:r>
-            <w:proofErr w:type="gramEnd"/>
-            <w:r>
-              <w:t>/react</w:t>
+            <w:r>
+              <w:t>@emotion/react</w:t>
             </w:r>
           </w:p>
         </w:tc>
@@ -2834,13 +2516,8 @@
             <w:pPr>
               <w:spacing w:after="160" w:line="278" w:lineRule="auto"/>
             </w:pPr>
-            <w:proofErr w:type="gramStart"/>
-            <w:r>
-              <w:t>@emotion</w:t>
-            </w:r>
-            <w:proofErr w:type="gramEnd"/>
-            <w:r>
-              <w:t>/styled</w:t>
+            <w:r>
+              <w:t>@emotion/styled</w:t>
             </w:r>
           </w:p>
         </w:tc>
@@ -2882,15 +2559,7 @@
               <w:spacing w:after="160" w:line="278" w:lineRule="auto"/>
             </w:pPr>
             <w:r>
-              <w:t xml:space="preserve">Remove together with Material UI after confirming it </w:t>
-            </w:r>
-            <w:proofErr w:type="gramStart"/>
-            <w:r>
-              <w:t>is no longer required</w:t>
-            </w:r>
-            <w:proofErr w:type="gramEnd"/>
-            <w:r>
-              <w:t>.</w:t>
+              <w:t>Remove together with Material UI after confirming it is no longer required.</w:t>
             </w:r>
           </w:p>
         </w:tc>
@@ -2906,15 +2575,7 @@
               <w:spacing w:after="160" w:line="278" w:lineRule="auto"/>
             </w:pPr>
             <w:r>
-              <w:t>semantic-</w:t>
-            </w:r>
-            <w:proofErr w:type="spellStart"/>
-            <w:r>
-              <w:t>ui</w:t>
-            </w:r>
-            <w:proofErr w:type="spellEnd"/>
-            <w:r>
-              <w:t>-react</w:t>
+              <w:t>semantic-ui-react</w:t>
             </w:r>
           </w:p>
         </w:tc>
@@ -2942,23 +2603,7 @@
               <w:spacing w:after="160" w:line="278" w:lineRule="auto"/>
             </w:pPr>
             <w:r>
-              <w:t xml:space="preserve">Provides the Button, Header, Grid, </w:t>
-            </w:r>
-            <w:proofErr w:type="spellStart"/>
-            <w:r>
-              <w:t>GridRow</w:t>
-            </w:r>
-            <w:proofErr w:type="spellEnd"/>
-            <w:r>
-              <w:t xml:space="preserve">, </w:t>
-            </w:r>
-            <w:proofErr w:type="spellStart"/>
-            <w:r>
-              <w:t>GridColumn</w:t>
-            </w:r>
-            <w:proofErr w:type="spellEnd"/>
-            <w:r>
-              <w:t>, Icon and Image components currently used by the project.</w:t>
+              <w:t>Provides the Button, Header, Grid, GridRow, GridColumn, Icon and Image components currently used by the project.</w:t>
             </w:r>
           </w:p>
         </w:tc>
@@ -2988,21 +2633,8 @@
               <w:spacing w:after="160" w:line="278" w:lineRule="auto"/>
             </w:pPr>
             <w:r>
-              <w:t>semantic-</w:t>
-            </w:r>
-            <w:proofErr w:type="spellStart"/>
-            <w:r>
-              <w:t>ui</w:t>
-            </w:r>
-            <w:proofErr w:type="spellEnd"/>
-            <w:r>
-              <w:t>-</w:t>
-            </w:r>
-            <w:proofErr w:type="spellStart"/>
-            <w:r>
-              <w:t>css</w:t>
-            </w:r>
-            <w:proofErr w:type="spellEnd"/>
+              <w:t>semantic-ui-css</w:t>
+            </w:r>
           </w:p>
         </w:tc>
         <w:tc>
@@ -3058,11 +2690,9 @@
             <w:pPr>
               <w:spacing w:after="160" w:line="278" w:lineRule="auto"/>
             </w:pPr>
-            <w:proofErr w:type="spellStart"/>
             <w:r>
               <w:t>antd</w:t>
             </w:r>
-            <w:proofErr w:type="spellEnd"/>
           </w:p>
         </w:tc>
         <w:tc>
@@ -3075,17 +2705,7 @@
               <w:spacing w:after="160" w:line="278" w:lineRule="auto"/>
             </w:pPr>
             <w:r>
-              <w:t xml:space="preserve">Declared version in </w:t>
-            </w:r>
-            <w:proofErr w:type="spellStart"/>
-            <w:proofErr w:type="gramStart"/>
-            <w:r>
-              <w:t>package.json</w:t>
-            </w:r>
-            <w:proofErr w:type="spellEnd"/>
-            <w:proofErr w:type="gramEnd"/>
-            <w:r>
-              <w:t>: ^5.22.3</w:t>
+              <w:t>Declared version in package.json: ^5.22.3</w:t>
             </w:r>
             <w:r>
               <w:br/>
@@ -3142,67 +2762,7 @@
         <w:t>UI</w:t>
       </w:r>
       <w:r>
-        <w:t xml:space="preserve"> dependencies </w:t>
-      </w:r>
-      <w:proofErr w:type="gramStart"/>
-      <w:r>
-        <w:t>were checked</w:t>
-      </w:r>
-      <w:proofErr w:type="gramEnd"/>
-      <w:r>
-        <w:t xml:space="preserve"> against both </w:t>
-      </w:r>
-      <w:proofErr w:type="spellStart"/>
-      <w:proofErr w:type="gramStart"/>
-      <w:r>
-        <w:t>package.json</w:t>
-      </w:r>
-      <w:proofErr w:type="spellEnd"/>
-      <w:proofErr w:type="gramEnd"/>
-      <w:r>
-        <w:t xml:space="preserve"> and package-</w:t>
-      </w:r>
-      <w:proofErr w:type="spellStart"/>
-      <w:proofErr w:type="gramStart"/>
-      <w:r>
-        <w:t>lock.json</w:t>
-      </w:r>
-      <w:proofErr w:type="spellEnd"/>
-      <w:proofErr w:type="gramEnd"/>
-      <w:r>
-        <w:t xml:space="preserve">. The current local Ant Design installation </w:t>
-      </w:r>
-      <w:proofErr w:type="gramStart"/>
-      <w:r>
-        <w:t>was also confirmed</w:t>
-      </w:r>
-      <w:proofErr w:type="gramEnd"/>
-      <w:r>
-        <w:t xml:space="preserve"> using </w:t>
-      </w:r>
-      <w:proofErr w:type="spellStart"/>
-      <w:r>
-        <w:t>npm</w:t>
-      </w:r>
-      <w:proofErr w:type="spellEnd"/>
-      <w:r>
-        <w:t xml:space="preserve">. These items create a list to help with Sprint 2 cleanup. Outdated UI dependencies should only </w:t>
-      </w:r>
-      <w:proofErr w:type="gramStart"/>
-      <w:r>
-        <w:t>be deleted</w:t>
-      </w:r>
-      <w:proofErr w:type="gramEnd"/>
-      <w:r>
-        <w:t xml:space="preserve"> after the migration </w:t>
-      </w:r>
-      <w:proofErr w:type="gramStart"/>
-      <w:r>
-        <w:t>is done</w:t>
-      </w:r>
-      <w:proofErr w:type="gramEnd"/>
-      <w:r>
-        <w:t xml:space="preserve"> after testing shows everything works and after there are no imports left in the project.</w:t>
+        <w:t xml:space="preserve"> dependencies were checked against both package.json and package-lock.json. The current local Ant Design installation was also confirmed using npm. These items create a list to help with Sprint 2 cleanup. Outdated UI dependencies should only be deleted after the migration is done after testing shows everything works and after there are no imports left in the project.</w:t>
       </w:r>
     </w:p>
     <w:p>
@@ -3262,15 +2822,7 @@
     </w:p>
     <w:p>
       <w:r>
-        <w:t xml:space="preserve">The Ant Design package </w:t>
-      </w:r>
-      <w:proofErr w:type="gramStart"/>
-      <w:r>
-        <w:t>is already installed</w:t>
-      </w:r>
-      <w:proofErr w:type="gramEnd"/>
-      <w:r>
-        <w:t xml:space="preserve"> in the project.</w:t>
+        <w:t>The Ant Design package is already installed in the project.</w:t>
       </w:r>
     </w:p>
     <w:p>
@@ -3279,96 +2831,20 @@
       </w:r>
     </w:p>
     <w:p>
-      <w:proofErr w:type="spellStart"/>
-      <w:r>
-        <w:rPr>
-          <w:b/>
-          <w:bCs/>
-        </w:rPr>
-        <w:t>antd</w:t>
-      </w:r>
-      <w:proofErr w:type="spellEnd"/>
-      <w:r>
-        <w:rPr>
-          <w:b/>
-          <w:bCs/>
-        </w:rPr>
-        <w:t xml:space="preserve"> 5.29.3</w:t>
-      </w:r>
-    </w:p>
-    <w:p>
-      <w:proofErr w:type="gramStart"/>
-      <w:r>
-        <w:t>@ant</w:t>
-      </w:r>
-      <w:proofErr w:type="gramEnd"/>
-      <w:r>
-        <w:t xml:space="preserve">-design/icons </w:t>
-      </w:r>
-      <w:proofErr w:type="gramStart"/>
-      <w:r>
-        <w:t>is not declared</w:t>
-      </w:r>
-      <w:proofErr w:type="gramEnd"/>
-      <w:r>
-        <w:t xml:space="preserve"> as a direct project dependency </w:t>
-      </w:r>
-      <w:proofErr w:type="gramStart"/>
-      <w:r>
-        <w:t>in</w:t>
-      </w:r>
-      <w:proofErr w:type="gramEnd"/>
-      <w:r>
-        <w:t xml:space="preserve"> </w:t>
-      </w:r>
-      <w:proofErr w:type="spellStart"/>
-      <w:proofErr w:type="gramStart"/>
-      <w:r>
-        <w:t>package.json</w:t>
-      </w:r>
-      <w:proofErr w:type="spellEnd"/>
-      <w:proofErr w:type="gramEnd"/>
-      <w:r>
-        <w:t>. It is present as a dependency of Ant Design in package-</w:t>
-      </w:r>
-      <w:proofErr w:type="spellStart"/>
-      <w:proofErr w:type="gramStart"/>
-      <w:r>
-        <w:t>lock.json</w:t>
-      </w:r>
-      <w:proofErr w:type="spellEnd"/>
-      <w:proofErr w:type="gramEnd"/>
-      <w:r>
-        <w:t xml:space="preserve">. If Sprint 2 requires direct icon imports, the team should confirm whether it needs to </w:t>
-      </w:r>
-      <w:proofErr w:type="gramStart"/>
-      <w:r>
-        <w:t>be added</w:t>
-      </w:r>
-      <w:proofErr w:type="gramEnd"/>
-      <w:r>
-        <w:t xml:space="preserve"> explicitly as a direct </w:t>
-      </w:r>
-      <w:proofErr w:type="spellStart"/>
-      <w:proofErr w:type="gramStart"/>
-      <w:r>
-        <w:t>dependency.</w:t>
-      </w:r>
-      <w:r>
-        <w:t>This</w:t>
-      </w:r>
-      <w:proofErr w:type="spellEnd"/>
-      <w:proofErr w:type="gramEnd"/>
-      <w:r>
-        <w:t xml:space="preserve"> means the migration can begin without installing the main Ant Design library, although icons may need to </w:t>
-      </w:r>
-      <w:proofErr w:type="gramStart"/>
-      <w:r>
-        <w:t>be added</w:t>
-      </w:r>
-      <w:proofErr w:type="gramEnd"/>
-      <w:r>
-        <w:t xml:space="preserve"> later if required.</w:t>
+      <w:r>
+        <w:rPr>
+          <w:b/>
+          <w:bCs/>
+        </w:rPr>
+        <w:t>antd 5.29.3</w:t>
+      </w:r>
+    </w:p>
+    <w:p>
+      <w:r>
+        <w:t>@ant-design/icons is not declared as a direct project dependency in package.json. It is present as a dependency of Ant Design in package-lock.json. If Sprint 2 requires direct icon imports, the team should confirm whether it needs to be added explicitly as a direct dependency.</w:t>
+      </w:r>
+      <w:r>
+        <w:t>This means the migration can begin without installing the main Ant Design library, although icons may need to be added later if required.</w:t>
       </w:r>
     </w:p>
     <w:p>
@@ -3770,11 +3246,9 @@
             <w:pPr>
               <w:spacing w:after="160" w:line="278" w:lineRule="auto"/>
             </w:pPr>
-            <w:proofErr w:type="spellStart"/>
             <w:r>
               <w:t>Typography.Title</w:t>
             </w:r>
-            <w:proofErr w:type="spellEnd"/>
           </w:p>
         </w:tc>
         <w:tc>
@@ -3874,11 +3348,9 @@
             <w:pPr>
               <w:spacing w:after="160" w:line="278" w:lineRule="auto"/>
             </w:pPr>
-            <w:proofErr w:type="spellStart"/>
             <w:r>
               <w:t>GridRow</w:t>
             </w:r>
-            <w:proofErr w:type="spellEnd"/>
           </w:p>
         </w:tc>
         <w:tc>
@@ -3934,11 +3406,9 @@
             <w:pPr>
               <w:spacing w:after="160" w:line="278" w:lineRule="auto"/>
             </w:pPr>
-            <w:proofErr w:type="spellStart"/>
             <w:r>
               <w:t>GridColumn</w:t>
             </w:r>
-            <w:proofErr w:type="spellEnd"/>
           </w:p>
         </w:tc>
         <w:tc>
@@ -4118,47 +3588,7 @@
     </w:p>
     <w:p>
       <w:r>
-        <w:t xml:space="preserve">The Settings.js Slider should </w:t>
-      </w:r>
-      <w:proofErr w:type="gramStart"/>
-      <w:r>
-        <w:t>be reviewed</w:t>
-      </w:r>
-      <w:proofErr w:type="gramEnd"/>
-      <w:r>
-        <w:t xml:space="preserve"> after migration to ensure its styling and </w:t>
-      </w:r>
-      <w:proofErr w:type="spellStart"/>
-      <w:r>
-        <w:t>behaviour</w:t>
-      </w:r>
-      <w:proofErr w:type="spellEnd"/>
-      <w:r>
-        <w:t xml:space="preserve"> remain consistent with the current interface. The </w:t>
-      </w:r>
-      <w:proofErr w:type="spellStart"/>
-      <w:r>
-        <w:t>RecipeCardExtension</w:t>
-      </w:r>
-      <w:proofErr w:type="spellEnd"/>
-      <w:r>
-        <w:t xml:space="preserve"> component should also </w:t>
-      </w:r>
-      <w:proofErr w:type="gramStart"/>
-      <w:r>
-        <w:t>be reviewed</w:t>
-      </w:r>
-      <w:proofErr w:type="gramEnd"/>
-      <w:r>
-        <w:t xml:space="preserve"> because replacing the Semantic UI Grid layout with Ant Design Row and Col components may affect spacing, </w:t>
-      </w:r>
-      <w:proofErr w:type="gramStart"/>
-      <w:r>
-        <w:t>alignment</w:t>
-      </w:r>
-      <w:proofErr w:type="gramEnd"/>
-      <w:r>
-        <w:t xml:space="preserve"> and responsiveness.</w:t>
+        <w:t>The Settings.js Slider should be reviewed after migration to ensure its styling and behaviour remain consistent with the current interface. The RecipeCardExtension component should also be reviewed because replacing the Semantic UI Grid layout with Ant Design Row and Col components may affect spacing, alignment and responsiveness.</w:t>
       </w:r>
     </w:p>
     <w:p>
@@ -4191,31 +3621,7 @@
     </w:p>
     <w:p>
       <w:r>
-        <w:t xml:space="preserve">Based on the audit findings, Sprint 2 should begin by replacing the Button components in the </w:t>
-      </w:r>
-      <w:proofErr w:type="spellStart"/>
-      <w:r>
-        <w:t>CreateRecipe</w:t>
-      </w:r>
-      <w:proofErr w:type="spellEnd"/>
-      <w:r>
-        <w:t xml:space="preserve"> module because they have the lowest migration complexity. The Header component should then be migrated, followed by the Material UI Slider in Settings.js. The </w:t>
-      </w:r>
-      <w:proofErr w:type="spellStart"/>
-      <w:r>
-        <w:t>RecipeCardExtension</w:t>
-      </w:r>
-      <w:proofErr w:type="spellEnd"/>
-      <w:r>
-        <w:t xml:space="preserve"> component should be migrated last because it contains multiple layout and visual elements that require additional testing. After all components have been migrated, regression testing should </w:t>
-      </w:r>
-      <w:proofErr w:type="gramStart"/>
-      <w:r>
-        <w:t>be completed</w:t>
-      </w:r>
-      <w:proofErr w:type="gramEnd"/>
-      <w:r>
-        <w:t xml:space="preserve"> before removing unused UI library dependencies.</w:t>
+        <w:t>Based on the audit findings, Sprint 2 should begin by replacing the Button components in the CreateRecipe module because they have the lowest migration complexity. The Header component should then be migrated, followed by the Material UI Slider in Settings.js. The RecipeCardExtension component should be migrated last because it contains multiple layout and visual elements that require additional testing. After all components have been migrated, regression testing should be completed before removing unused UI library dependencies.</w:t>
       </w:r>
     </w:p>
     <w:p/>
@@ -4242,9 +3648,10 @@
         <w:tblLook w:val="04A0" w:firstRow="1" w:lastRow="0" w:firstColumn="1" w:lastColumn="0" w:noHBand="0" w:noVBand="1"/>
       </w:tblPr>
       <w:tblGrid>
-        <w:gridCol w:w="3397"/>
-        <w:gridCol w:w="4155"/>
-        <w:gridCol w:w="1798"/>
+        <w:gridCol w:w="2014"/>
+        <w:gridCol w:w="2797"/>
+        <w:gridCol w:w="1729"/>
+        <w:gridCol w:w="2810"/>
       </w:tblGrid>
       <w:tr>
         <w:tc>
@@ -4271,7 +3678,7 @@
         </w:tc>
         <w:tc>
           <w:tcPr>
-            <w:tcW w:w="0" w:type="auto"/>
+            <w:tcW w:w="2797" w:type="dxa"/>
             <w:hideMark/>
           </w:tcPr>
           <w:p>
@@ -4293,8 +3700,7 @@
         </w:tc>
         <w:tc>
           <w:tcPr>
-            <w:tcW w:w="0" w:type="auto"/>
-            <w:hideMark/>
+            <w:tcW w:w="1729" w:type="dxa"/>
           </w:tcPr>
           <w:p>
             <w:pPr>
@@ -4313,6 +3719,28 @@
             </w:r>
           </w:p>
         </w:tc>
+        <w:tc>
+          <w:tcPr>
+            <w:tcW w:w="2810" w:type="dxa"/>
+            <w:hideMark/>
+          </w:tcPr>
+          <w:p>
+            <w:pPr>
+              <w:spacing w:after="160" w:line="278" w:lineRule="auto"/>
+              <w:rPr>
+                <w:b/>
+                <w:bCs/>
+              </w:rPr>
+            </w:pPr>
+            <w:r>
+              <w:rPr>
+                <w:b/>
+                <w:bCs/>
+              </w:rPr>
+              <w:t>Estimated effort</w:t>
+            </w:r>
+          </w:p>
+        </w:tc>
       </w:tr>
       <w:tr>
         <w:tc>
@@ -4331,40 +3759,21 @@
         </w:tc>
         <w:tc>
           <w:tcPr>
-            <w:tcW w:w="0" w:type="auto"/>
-            <w:hideMark/>
-          </w:tcPr>
-          <w:p>
-            <w:pPr>
-              <w:spacing w:after="160" w:line="278" w:lineRule="auto"/>
-            </w:pPr>
-            <w:proofErr w:type="spellStart"/>
-            <w:r>
-              <w:t>Fields.jsx</w:t>
-            </w:r>
-            <w:proofErr w:type="spellEnd"/>
-            <w:r>
-              <w:t xml:space="preserve">, </w:t>
-            </w:r>
-            <w:proofErr w:type="spellStart"/>
-            <w:r>
-              <w:t>Inputs.jsx</w:t>
-            </w:r>
-            <w:proofErr w:type="spellEnd"/>
-            <w:r>
-              <w:t xml:space="preserve">, </w:t>
-            </w:r>
-            <w:proofErr w:type="spellStart"/>
-            <w:r>
-              <w:t>SectionIngredients.jsx</w:t>
-            </w:r>
-            <w:proofErr w:type="spellEnd"/>
-          </w:p>
-        </w:tc>
-        <w:tc>
-          <w:tcPr>
-            <w:tcW w:w="0" w:type="auto"/>
-            <w:hideMark/>
+            <w:tcW w:w="2797" w:type="dxa"/>
+            <w:hideMark/>
+          </w:tcPr>
+          <w:p>
+            <w:pPr>
+              <w:spacing w:after="160" w:line="278" w:lineRule="auto"/>
+            </w:pPr>
+            <w:r>
+              <w:t>Fields.jsx, Inputs.jsx, SectionIngredients.jsx</w:t>
+            </w:r>
+          </w:p>
+        </w:tc>
+        <w:tc>
+          <w:tcPr>
+            <w:tcW w:w="1729" w:type="dxa"/>
           </w:tcPr>
           <w:p>
             <w:pPr>
@@ -4372,6 +3781,20 @@
             </w:pPr>
             <w:r>
               <w:t>Low</w:t>
+            </w:r>
+          </w:p>
+        </w:tc>
+        <w:tc>
+          <w:tcPr>
+            <w:tcW w:w="2810" w:type="dxa"/>
+            <w:hideMark/>
+          </w:tcPr>
+          <w:p>
+            <w:pPr>
+              <w:spacing w:after="160" w:line="278" w:lineRule="auto"/>
+            </w:pPr>
+            <w:r>
+              <w:t>3-4 hours</w:t>
             </w:r>
           </w:p>
         </w:tc>
@@ -4393,24 +3816,21 @@
         </w:tc>
         <w:tc>
           <w:tcPr>
-            <w:tcW w:w="0" w:type="auto"/>
-            <w:hideMark/>
-          </w:tcPr>
-          <w:p>
-            <w:pPr>
-              <w:spacing w:after="160" w:line="278" w:lineRule="auto"/>
-            </w:pPr>
-            <w:proofErr w:type="spellStart"/>
+            <w:tcW w:w="2797" w:type="dxa"/>
+            <w:hideMark/>
+          </w:tcPr>
+          <w:p>
+            <w:pPr>
+              <w:spacing w:after="160" w:line="278" w:lineRule="auto"/>
+            </w:pPr>
             <w:r>
               <w:t>SectionHeader.jsx</w:t>
             </w:r>
-            <w:proofErr w:type="spellEnd"/>
-          </w:p>
-        </w:tc>
-        <w:tc>
-          <w:tcPr>
-            <w:tcW w:w="0" w:type="auto"/>
-            <w:hideMark/>
+          </w:p>
+        </w:tc>
+        <w:tc>
+          <w:tcPr>
+            <w:tcW w:w="1729" w:type="dxa"/>
           </w:tcPr>
           <w:p>
             <w:pPr>
@@ -4418,6 +3838,20 @@
             </w:pPr>
             <w:r>
               <w:t>Low</w:t>
+            </w:r>
+          </w:p>
+        </w:tc>
+        <w:tc>
+          <w:tcPr>
+            <w:tcW w:w="2810" w:type="dxa"/>
+            <w:hideMark/>
+          </w:tcPr>
+          <w:p>
+            <w:pPr>
+              <w:spacing w:after="160" w:line="278" w:lineRule="auto"/>
+            </w:pPr>
+            <w:r>
+              <w:t>2-3 hours</w:t>
             </w:r>
           </w:p>
         </w:tc>
@@ -4439,7 +3873,7 @@
         </w:tc>
         <w:tc>
           <w:tcPr>
-            <w:tcW w:w="0" w:type="auto"/>
+            <w:tcW w:w="2797" w:type="dxa"/>
             <w:hideMark/>
           </w:tcPr>
           <w:p>
@@ -4453,8 +3887,7 @@
         </w:tc>
         <w:tc>
           <w:tcPr>
-            <w:tcW w:w="0" w:type="auto"/>
-            <w:hideMark/>
+            <w:tcW w:w="1729" w:type="dxa"/>
           </w:tcPr>
           <w:p>
             <w:pPr>
@@ -4462,6 +3895,20 @@
             </w:pPr>
             <w:r>
               <w:t>Medium</w:t>
+            </w:r>
+          </w:p>
+        </w:tc>
+        <w:tc>
+          <w:tcPr>
+            <w:tcW w:w="2810" w:type="dxa"/>
+            <w:hideMark/>
+          </w:tcPr>
+          <w:p>
+            <w:pPr>
+              <w:spacing w:after="160" w:line="278" w:lineRule="auto"/>
+            </w:pPr>
+            <w:r>
+              <w:t>4-6 hours</w:t>
             </w:r>
           </w:p>
         </w:tc>
@@ -4483,24 +3930,21 @@
         </w:tc>
         <w:tc>
           <w:tcPr>
-            <w:tcW w:w="0" w:type="auto"/>
-            <w:hideMark/>
-          </w:tcPr>
-          <w:p>
-            <w:pPr>
-              <w:spacing w:after="160" w:line="278" w:lineRule="auto"/>
-            </w:pPr>
-            <w:proofErr w:type="spellStart"/>
+            <w:tcW w:w="2797" w:type="dxa"/>
+            <w:hideMark/>
+          </w:tcPr>
+          <w:p>
+            <w:pPr>
+              <w:spacing w:after="160" w:line="278" w:lineRule="auto"/>
+            </w:pPr>
             <w:r>
               <w:t>RecipeCardExtension.jsx</w:t>
             </w:r>
-            <w:proofErr w:type="spellEnd"/>
-          </w:p>
-        </w:tc>
-        <w:tc>
-          <w:tcPr>
-            <w:tcW w:w="0" w:type="auto"/>
-            <w:hideMark/>
+          </w:p>
+        </w:tc>
+        <w:tc>
+          <w:tcPr>
+            <w:tcW w:w="1729" w:type="dxa"/>
           </w:tcPr>
           <w:p>
             <w:pPr>
@@ -4508,6 +3952,20 @@
             </w:pPr>
             <w:r>
               <w:t>High</w:t>
+            </w:r>
+          </w:p>
+        </w:tc>
+        <w:tc>
+          <w:tcPr>
+            <w:tcW w:w="2810" w:type="dxa"/>
+            <w:hideMark/>
+          </w:tcPr>
+          <w:p>
+            <w:pPr>
+              <w:spacing w:after="160" w:line="278" w:lineRule="auto"/>
+            </w:pPr>
+            <w:r>
+              <w:t>6-8 hours</w:t>
             </w:r>
           </w:p>
         </w:tc>
@@ -4529,7 +3987,7 @@
         </w:tc>
         <w:tc>
           <w:tcPr>
-            <w:tcW w:w="0" w:type="auto"/>
+            <w:tcW w:w="2797" w:type="dxa"/>
             <w:hideMark/>
           </w:tcPr>
           <w:p>
@@ -4543,8 +4001,7 @@
         </w:tc>
         <w:tc>
           <w:tcPr>
-            <w:tcW w:w="0" w:type="auto"/>
-            <w:hideMark/>
+            <w:tcW w:w="1729" w:type="dxa"/>
           </w:tcPr>
           <w:p>
             <w:pPr>
@@ -4552,12 +4009,30 @@
             </w:pPr>
             <w:r>
               <w:t>Medium</w:t>
+            </w:r>
+          </w:p>
+        </w:tc>
+        <w:tc>
+          <w:tcPr>
+            <w:tcW w:w="2810" w:type="dxa"/>
+            <w:hideMark/>
+          </w:tcPr>
+          <w:p>
+            <w:pPr>
+              <w:spacing w:after="160" w:line="278" w:lineRule="auto"/>
+            </w:pPr>
+            <w:r>
+              <w:t xml:space="preserve">4-6 hours </w:t>
             </w:r>
           </w:p>
         </w:tc>
       </w:tr>
     </w:tbl>
-    <w:p/>
+    <w:p>
+      <w:r>
+        <w:t>Effort Estimation: The estimated effort is shown as a range of implementation hours, for Sprint 2 planning. This Effort Estimation includes component replacement, styling and layout adjustments, functional verification, accessibility checks and required testing. Actual effort may vary depending on design sign-off issues identified during regression testing and the amount of existing test coverage.</w:t>
+      </w:r>
+    </w:p>
     <w:p>
       <w:pPr>
         <w:rPr>
@@ -4586,49 +4061,8 @@
           <w:b/>
           <w:bCs/>
         </w:rPr>
-        <w:t xml:space="preserve">Button components – </w:t>
-      </w:r>
-      <w:proofErr w:type="spellStart"/>
-      <w:r>
-        <w:rPr>
-          <w:b/>
-          <w:bCs/>
-        </w:rPr>
-        <w:t>Fields.jsx</w:t>
-      </w:r>
-      <w:proofErr w:type="spellEnd"/>
-      <w:r>
-        <w:rPr>
-          <w:b/>
-          <w:bCs/>
-        </w:rPr>
-        <w:t xml:space="preserve">, </w:t>
-      </w:r>
-      <w:proofErr w:type="spellStart"/>
-      <w:r>
-        <w:rPr>
-          <w:b/>
-          <w:bCs/>
-        </w:rPr>
-        <w:t>Inputs.jsx</w:t>
-      </w:r>
-      <w:proofErr w:type="spellEnd"/>
-      <w:r>
-        <w:rPr>
-          <w:b/>
-          <w:bCs/>
-        </w:rPr>
-        <w:t xml:space="preserve"> and </w:t>
-      </w:r>
-      <w:proofErr w:type="spellStart"/>
-      <w:r>
-        <w:rPr>
-          <w:b/>
-          <w:bCs/>
-        </w:rPr>
-        <w:t>SectionIngredients.jsx</w:t>
-      </w:r>
-      <w:proofErr w:type="spellEnd"/>
+        <w:t>Button components – Fields.jsx, Inputs.jsx and SectionIngredients.jsx</w:t>
+      </w:r>
     </w:p>
     <w:p>
       <w:pPr>
@@ -4640,15 +4074,7 @@
         <w:spacing w:after="0" w:line="278" w:lineRule="auto"/>
       </w:pPr>
       <w:r>
-        <w:t xml:space="preserve">Semantic UI Button imports need to </w:t>
-      </w:r>
-      <w:proofErr w:type="gramStart"/>
-      <w:r>
-        <w:t>be changed</w:t>
-      </w:r>
-      <w:proofErr w:type="gramEnd"/>
-      <w:r>
-        <w:t xml:space="preserve"> to Ant Design Button components.</w:t>
+        <w:t>Semantic UI Button imports need to be changed to Ant Design Button components.</w:t>
       </w:r>
     </w:p>
     <w:p>
@@ -4702,15 +4128,7 @@
         <w:spacing w:after="0" w:line="278" w:lineRule="auto"/>
       </w:pPr>
       <w:r>
-        <w:t xml:space="preserve">Buttons should have </w:t>
-      </w:r>
-      <w:proofErr w:type="gramStart"/>
-      <w:r>
-        <w:t>an</w:t>
-      </w:r>
-      <w:proofErr w:type="gramEnd"/>
-      <w:r>
-        <w:t xml:space="preserve"> visible focus state.</w:t>
+        <w:t>Buttons should have an visible focus state.</w:t>
       </w:r>
     </w:p>
     <w:p>
@@ -4751,18 +4169,6 @@
     </w:p>
     <w:p>
       <w:pPr>
-        <w:pStyle w:val="ListParagraph"/>
-      </w:pPr>
-    </w:p>
-    <w:p>
-      <w:pPr>
-        <w:pStyle w:val="ListParagraph"/>
-        <w:spacing w:after="0" w:line="278" w:lineRule="auto"/>
-      </w:pPr>
-    </w:p>
-    <w:p>
-      <w:pPr>
-        <w:pStyle w:val="ListParagraph"/>
         <w:spacing w:after="0" w:line="278" w:lineRule="auto"/>
       </w:pPr>
     </w:p>
@@ -4781,20 +4187,8 @@
           <w:sz w:val="28"/>
           <w:szCs w:val="28"/>
         </w:rPr>
-        <w:lastRenderedPageBreak/>
-        <w:t xml:space="preserve">Header component – </w:t>
-      </w:r>
-      <w:proofErr w:type="spellStart"/>
-      <w:r>
-        <w:rPr>
-          <w:b/>
-          <w:bCs/>
-          <w:sz w:val="28"/>
-          <w:szCs w:val="28"/>
-        </w:rPr>
-        <w:t>SectionHeader.jsx</w:t>
-      </w:r>
-      <w:proofErr w:type="spellEnd"/>
+        <w:t>Header component – SectionHeader.jsx</w:t>
+      </w:r>
     </w:p>
     <w:p>
       <w:pPr>
@@ -4805,15 +4199,7 @@
         <w:spacing w:after="160" w:line="278" w:lineRule="auto"/>
       </w:pPr>
       <w:r>
-        <w:t xml:space="preserve">The Semantic UI Header must </w:t>
-      </w:r>
-      <w:proofErr w:type="gramStart"/>
-      <w:r>
-        <w:t>be replaced</w:t>
-      </w:r>
-      <w:proofErr w:type="gramEnd"/>
-      <w:r>
-        <w:t xml:space="preserve"> with the appropriate Ant Design Typography component. </w:t>
+        <w:t xml:space="preserve">The Semantic UI Header must be replaced with the appropriate Ant Design Typography component. </w:t>
       </w:r>
     </w:p>
     <w:p>
@@ -4891,15 +4277,7 @@
         <w:spacing w:after="0" w:line="278" w:lineRule="auto"/>
       </w:pPr>
       <w:r>
-        <w:t xml:space="preserve">The Material UI Slider needs to </w:t>
-      </w:r>
-      <w:proofErr w:type="gramStart"/>
-      <w:r>
-        <w:t>be replaced</w:t>
-      </w:r>
-      <w:proofErr w:type="gramEnd"/>
-      <w:r>
-        <w:t xml:space="preserve"> with the Ant Design Slider.</w:t>
+        <w:t>The Material UI Slider needs to be replaced with the Ant Design Slider.</w:t>
       </w:r>
     </w:p>
     <w:p>
@@ -4917,23 +4295,7 @@
         <w:spacing w:after="0" w:line="278" w:lineRule="auto"/>
       </w:pPr>
       <w:r>
-        <w:t xml:space="preserve">The Ant Design Slider must have the minimum maximum, </w:t>
-      </w:r>
-      <w:proofErr w:type="gramStart"/>
-      <w:r>
-        <w:t>step</w:t>
-      </w:r>
-      <w:proofErr w:type="gramEnd"/>
-      <w:r>
-        <w:t xml:space="preserve"> and value </w:t>
-      </w:r>
-      <w:proofErr w:type="spellStart"/>
-      <w:r>
-        <w:t>behaviour</w:t>
-      </w:r>
-      <w:proofErr w:type="spellEnd"/>
-      <w:r>
-        <w:t>, as the original.</w:t>
+        <w:t>The Ant Design Slider must have the minimum maximum, step and value behaviour, as the original.</w:t>
       </w:r>
     </w:p>
     <w:p>
@@ -5047,21 +4409,53 @@
       <w:pPr>
         <w:spacing w:after="160" w:line="278" w:lineRule="auto"/>
         <w:rPr>
+          <w:b/>
+          <w:bCs/>
           <w:sz w:val="28"/>
           <w:szCs w:val="28"/>
         </w:rPr>
       </w:pPr>
-      <w:proofErr w:type="spellStart"/>
-      <w:r>
+    </w:p>
+    <w:p>
+      <w:pPr>
+        <w:spacing w:after="160" w:line="278" w:lineRule="auto"/>
         <w:rPr>
           <w:b/>
           <w:bCs/>
           <w:sz w:val="28"/>
           <w:szCs w:val="28"/>
         </w:rPr>
+      </w:pPr>
+    </w:p>
+    <w:p>
+      <w:pPr>
+        <w:spacing w:after="160" w:line="278" w:lineRule="auto"/>
+        <w:rPr>
+          <w:b/>
+          <w:bCs/>
+          <w:sz w:val="28"/>
+          <w:szCs w:val="28"/>
+        </w:rPr>
+      </w:pPr>
+    </w:p>
+    <w:p>
+      <w:pPr>
+        <w:spacing w:after="160" w:line="278" w:lineRule="auto"/>
+        <w:rPr>
+          <w:sz w:val="28"/>
+          <w:szCs w:val="28"/>
+        </w:rPr>
+      </w:pPr>
+      <w:r>
+        <w:rPr>
+          <w:b/>
+          <w:bCs/>
+          <w:sz w:val="28"/>
+          <w:szCs w:val="28"/>
+        </w:rPr>
+        <w:lastRenderedPageBreak/>
         <w:t>RecipeCardExtension.jsx</w:t>
       </w:r>
-      <w:proofErr w:type="spellEnd"/>
     </w:p>
     <w:p>
       <w:pPr>
@@ -5073,31 +4467,7 @@
         <w:spacing w:after="0" w:line="240" w:lineRule="auto"/>
       </w:pPr>
       <w:r>
-        <w:t xml:space="preserve">Semantic UI Grid, </w:t>
-      </w:r>
-      <w:proofErr w:type="spellStart"/>
-      <w:r>
-        <w:t>GridRow</w:t>
-      </w:r>
-      <w:proofErr w:type="spellEnd"/>
-      <w:r>
-        <w:t xml:space="preserve"> and </w:t>
-      </w:r>
-      <w:proofErr w:type="spellStart"/>
-      <w:r>
-        <w:t>GridColumn</w:t>
-      </w:r>
-      <w:proofErr w:type="spellEnd"/>
-      <w:r>
-        <w:t xml:space="preserve"> components must </w:t>
-      </w:r>
-      <w:proofErr w:type="gramStart"/>
-      <w:r>
-        <w:t>be replaced</w:t>
-      </w:r>
-      <w:proofErr w:type="gramEnd"/>
-      <w:r>
-        <w:t xml:space="preserve"> with Ant Design layout components.</w:t>
+        <w:t>Semantic UI Grid, GridRow and GridColumn components must be replaced with Ant Design layout components.</w:t>
       </w:r>
     </w:p>
     <w:p>
@@ -5115,15 +4485,43 @@
         <w:spacing w:after="0" w:line="240" w:lineRule="auto"/>
       </w:pPr>
       <w:r>
-        <w:t xml:space="preserve">Image and Icon components must </w:t>
-      </w:r>
-      <w:proofErr w:type="gramStart"/>
-      <w:r>
-        <w:t>be replaced</w:t>
-      </w:r>
-      <w:proofErr w:type="gramEnd"/>
-      <w:r>
-        <w:t xml:space="preserve"> with suitable Ant Design or approved project alternatives.</w:t>
+        <w:t>Image and Icon components must be replaced with suitable Ant Design or approved project alternatives.</w:t>
+      </w:r>
+    </w:p>
+    <w:p>
+      <w:pPr>
+        <w:pStyle w:val="ListParagraph"/>
+      </w:pPr>
+    </w:p>
+    <w:p>
+      <w:pPr>
+        <w:pStyle w:val="ListParagraph"/>
+        <w:numPr>
+          <w:ilvl w:val="0"/>
+          <w:numId w:val="15"/>
+        </w:numPr>
+        <w:spacing w:after="0"/>
+      </w:pPr>
+      <w:r>
+        <w:t>If Ant Design icons are selected for the migration add</w:t>
+      </w:r>
+      <w:r>
+        <w:t xml:space="preserve"> </w:t>
+      </w:r>
+      <w:r>
+        <w:t xml:space="preserve">@ant-design/icons </w:t>
+      </w:r>
+      <w:r>
+        <w:t> as a direct project dependency and update</w:t>
+      </w:r>
+      <w:r>
+        <w:t xml:space="preserve"> </w:t>
+      </w:r>
+      <w:r>
+        <w:t xml:space="preserve">package.json and package-lock.json accordingly. </w:t>
+      </w:r>
+      <w:r>
+        <w:t>Verify that the required icons import and render correctly after migration.</w:t>
       </w:r>
     </w:p>
     <w:p>
@@ -5159,15 +4557,7 @@
         <w:spacing w:after="0" w:line="240" w:lineRule="auto"/>
       </w:pPr>
       <w:r>
-        <w:t xml:space="preserve">The layout must remain responsive across mobile, </w:t>
-      </w:r>
-      <w:proofErr w:type="gramStart"/>
-      <w:r>
-        <w:t>tablet</w:t>
-      </w:r>
-      <w:proofErr w:type="gramEnd"/>
-      <w:r>
-        <w:t xml:space="preserve"> and desktop widths.</w:t>
+        <w:t>The layout must remain responsive across mobile, tablet and desktop widths.</w:t>
       </w:r>
     </w:p>
     <w:p>
@@ -5185,7 +4575,6 @@
         <w:spacing w:after="0" w:line="240" w:lineRule="auto"/>
       </w:pPr>
       <w:r>
-        <w:lastRenderedPageBreak/>
         <w:t>Interactive elements must support keyboard navigation and visible focus.</w:t>
       </w:r>
     </w:p>
@@ -5227,6 +4616,25 @@
     </w:p>
     <w:p>
       <w:pPr>
+        <w:pStyle w:val="ListParagraph"/>
+        <w:spacing w:line="240" w:lineRule="auto"/>
+      </w:pPr>
+    </w:p>
+    <w:p>
+      <w:pPr>
+        <w:pStyle w:val="ListParagraph"/>
+        <w:numPr>
+          <w:ilvl w:val="0"/>
+          <w:numId w:val="15"/>
+        </w:numPr>
+        <w:spacing w:after="0" w:line="276" w:lineRule="auto"/>
+      </w:pPr>
+      <w:r>
+        <w:t>Create automated component tests, for RecipeCardExtension.jsx as no dedicated test file was found during the frontend source review. The tests should check that the moved component displays properly keeps recipe-card features and actions and follows the intended responsive design behavior.</w:t>
+      </w:r>
+    </w:p>
+    <w:p>
+      <w:pPr>
         <w:spacing w:after="0" w:line="240" w:lineRule="auto"/>
       </w:pPr>
     </w:p>
@@ -5281,15 +4689,7 @@
         <w:spacing w:after="160" w:line="278" w:lineRule="auto"/>
       </w:pPr>
       <w:r>
-        <w:t xml:space="preserve">Search the project and confirm there are no </w:t>
-      </w:r>
-      <w:proofErr w:type="gramStart"/>
-      <w:r>
-        <w:t>remaining @</w:t>
-      </w:r>
-      <w:proofErr w:type="gramEnd"/>
-      <w:r>
-        <w:t xml:space="preserve">mui/material imports. </w:t>
+        <w:t xml:space="preserve">Search the project and confirm there are no remaining @mui/material imports. </w:t>
       </w:r>
     </w:p>
     <w:p>
@@ -5301,15 +4701,7 @@
         <w:spacing w:after="160" w:line="278" w:lineRule="auto"/>
       </w:pPr>
       <w:r>
-        <w:t>Confirm there are no remaining semantic-</w:t>
-      </w:r>
-      <w:proofErr w:type="spellStart"/>
-      <w:r>
-        <w:t>ui</w:t>
-      </w:r>
-      <w:proofErr w:type="spellEnd"/>
-      <w:r>
-        <w:t xml:space="preserve">-react imports. </w:t>
+        <w:t xml:space="preserve">Confirm there are no remaining semantic-ui-react imports. </w:t>
       </w:r>
     </w:p>
     <w:p>
@@ -5321,15 +4713,7 @@
         <w:spacing w:after="160" w:line="278" w:lineRule="auto"/>
       </w:pPr>
       <w:r>
-        <w:t xml:space="preserve">Confirm unused Semantic UI CSS imports </w:t>
-      </w:r>
-      <w:proofErr w:type="gramStart"/>
-      <w:r>
-        <w:t>are removed</w:t>
-      </w:r>
-      <w:proofErr w:type="gramEnd"/>
-      <w:r>
-        <w:t xml:space="preserve">. </w:t>
+        <w:t xml:space="preserve">Confirm unused Semantic UI CSS imports are removed. </w:t>
       </w:r>
     </w:p>
     <w:p>
@@ -5341,15 +4725,7 @@
         <w:spacing w:after="160" w:line="278" w:lineRule="auto"/>
       </w:pPr>
       <w:r>
-        <w:t xml:space="preserve">Confirm keyboard navigation and focus </w:t>
-      </w:r>
-      <w:proofErr w:type="spellStart"/>
-      <w:r>
-        <w:t>behaviour</w:t>
-      </w:r>
-      <w:proofErr w:type="spellEnd"/>
-      <w:r>
-        <w:t xml:space="preserve"> work correctly. </w:t>
+        <w:t xml:space="preserve">Confirm keyboard navigation and focus behaviour work correctly. </w:t>
       </w:r>
     </w:p>
     <w:p>
@@ -5373,21 +4749,9 @@
         <w:spacing w:after="160" w:line="278" w:lineRule="auto"/>
       </w:pPr>
       <w:r>
-        <w:t xml:space="preserve">Confirm text and interactive UI elements meet WCAG 2.1 AA </w:t>
-      </w:r>
-      <w:proofErr w:type="spellStart"/>
-      <w:r>
-        <w:t>colour</w:t>
-      </w:r>
-      <w:proofErr w:type="spellEnd"/>
-      <w:r>
-        <w:t xml:space="preserve">-contrast requirements, including at least 4.5:1 for normal text and 3:1 for large text and relevant UI </w:t>
-      </w:r>
-      <w:proofErr w:type="gramStart"/>
-      <w:r>
-        <w:t>components</w:t>
-      </w:r>
-      <w:proofErr w:type="gramEnd"/>
+        <w:lastRenderedPageBreak/>
+        <w:t>Confirm text and interactive UI elements meet WCAG 2.1 AA colour-contrast requirements, including at least 4.5:1 for normal text and 3:1 for large text and relevant UI components</w:t>
+      </w:r>
     </w:p>
     <w:p>
       <w:pPr>
@@ -5410,23 +4774,7 @@
         <w:spacing w:after="160" w:line="278" w:lineRule="auto"/>
       </w:pPr>
       <w:r>
-        <w:t xml:space="preserve">Confirm Create Recipe and </w:t>
-      </w:r>
-      <w:proofErr w:type="spellStart"/>
-      <w:r>
-        <w:t>RecipeCardExtension</w:t>
-      </w:r>
-      <w:proofErr w:type="spellEnd"/>
-      <w:r>
-        <w:t xml:space="preserve"> functionality still </w:t>
-      </w:r>
-      <w:proofErr w:type="gramStart"/>
-      <w:r>
-        <w:t>works</w:t>
-      </w:r>
-      <w:proofErr w:type="gramEnd"/>
-      <w:r>
-        <w:t xml:space="preserve">. </w:t>
+        <w:t xml:space="preserve">Confirm Create Recipe and RecipeCardExtension functionality still works. </w:t>
       </w:r>
     </w:p>
     <w:p>
@@ -5438,7 +4786,7 @@
         <w:spacing w:after="160" w:line="278" w:lineRule="auto"/>
       </w:pPr>
       <w:r>
-        <w:t xml:space="preserve">Run the available frontend tests and build successfully. </w:t>
+        <w:t>Run the existing frontend test suite together with the newly created RecipeCardExtension.jsx component tests and confirm that all relevant tests pass.</w:t>
       </w:r>
     </w:p>
     <w:p>
@@ -5458,12 +4806,33 @@
     </w:p>
     <w:p>
       <w:pPr>
+        <w:numPr>
+          <w:ilvl w:val="0"/>
+          <w:numId w:val="14"/>
+        </w:numPr>
+        <w:spacing w:after="160" w:line="278" w:lineRule="auto"/>
+      </w:pPr>
+      <w:r>
+        <w:t>Verify that affected migrated components have appropriate automated or regression test coverage and add further tests where required before final migration sign-off.</w:t>
+      </w:r>
+      <w:r>
+        <w:t xml:space="preserve"> </w:t>
+      </w:r>
+    </w:p>
+    <w:p>
+      <w:pPr>
         <w:spacing w:after="160" w:line="278" w:lineRule="auto"/>
         <w:ind w:left="720"/>
       </w:pPr>
     </w:p>
     <w:p>
       <w:pPr>
+        <w:spacing w:after="160" w:line="278" w:lineRule="auto"/>
+        <w:ind w:left="720"/>
+      </w:pPr>
+    </w:p>
+    <w:p>
+      <w:pPr>
         <w:rPr>
           <w:b/>
           <w:bCs/>
@@ -5492,75 +4861,12 @@
     </w:p>
     <w:p>
       <w:r>
-        <w:t xml:space="preserve">The audit found one Material UI component and five files using Semantic UI React. Most components have a migration complexity and can </w:t>
-      </w:r>
-      <w:proofErr w:type="gramStart"/>
-      <w:r>
-        <w:t>be replaced</w:t>
-      </w:r>
-      <w:proofErr w:type="gramEnd"/>
-      <w:r>
-        <w:t xml:space="preserve"> with equivalent Ant Design components with minimal effort. The only </w:t>
-      </w:r>
-      <w:r>
-        <w:t>component that needs</w:t>
-      </w:r>
-      <w:r>
-        <w:t xml:space="preserve"> attention is </w:t>
-      </w:r>
-      <w:proofErr w:type="spellStart"/>
-      <w:r>
-        <w:t>RecipeCardExtension</w:t>
-      </w:r>
-      <w:proofErr w:type="spellEnd"/>
-      <w:r>
-        <w:t xml:space="preserve"> </w:t>
-      </w:r>
-      <w:proofErr w:type="spellStart"/>
-      <w:r>
-        <w:t>jsx</w:t>
-      </w:r>
-      <w:proofErr w:type="spellEnd"/>
-      <w:r>
-        <w:t xml:space="preserve"> because it depends on multiple layout and visual components. Since Ant Design </w:t>
-      </w:r>
-      <w:proofErr w:type="gramStart"/>
-      <w:r>
-        <w:t>is already installed</w:t>
-      </w:r>
-      <w:proofErr w:type="gramEnd"/>
-      <w:r>
-        <w:t xml:space="preserve"> the project is ready for the migration phase.</w:t>
-      </w:r>
-    </w:p>
-    <w:p>
-      <w:r>
-        <w:lastRenderedPageBreak/>
-        <w:t xml:space="preserve">The findings from this audit give a picture of the current UI library usage in the </w:t>
-      </w:r>
-      <w:proofErr w:type="spellStart"/>
-      <w:r>
-        <w:t>NutriHelp</w:t>
-      </w:r>
-      <w:proofErr w:type="spellEnd"/>
-      <w:r>
-        <w:t xml:space="preserve"> frontend application. The suggested migration plan and Sprint 2 task sequence create a way to move the project to Ant Design while keeping migration risks low and making sure the user interface stays consistent. This audit can </w:t>
-      </w:r>
-      <w:proofErr w:type="gramStart"/>
-      <w:r>
-        <w:t>be used</w:t>
-      </w:r>
-      <w:proofErr w:type="gramEnd"/>
-      <w:r>
-        <w:t xml:space="preserve"> as a </w:t>
-      </w:r>
-      <w:proofErr w:type="gramStart"/>
-      <w:r>
-        <w:t>guide,</w:t>
-      </w:r>
-      <w:proofErr w:type="gramEnd"/>
-      <w:r>
-        <w:t xml:space="preserve"> for migration work and help with planning during the next sprint.</w:t>
+        <w:t>The audit identified one Material UI component and five files using Semantic UI React. Most components have low to medium migration complexity and can be replaced with equivalent Ant Design components with relatively limited implementation effort. RecipeCardExtension.jsx requires additional attention because it depends on multiple layout and visual components and currently has no dedicated automated test file identified within the reviewed frontend source. Since Ant Design is already installed, the project is ready to proceed to the migration phase.</w:t>
+      </w:r>
+    </w:p>
+    <w:p>
+      <w:r>
+        <w:t>The findings from this audit give a picture of the current UI library usage in the NutriHelp frontend application. The suggested migration plan and Sprint 2 task sequence create a way to move the project to Ant Design while keeping migration risks low and making sure the user interface stays consistent. This audit can be used as a guide, for migration work and help with planning during the next sprint.</w:t>
       </w:r>
     </w:p>
     <w:p>
@@ -5595,38 +4901,18 @@
           <w:sz w:val="28"/>
           <w:szCs w:val="28"/>
         </w:rPr>
+        <w:lastRenderedPageBreak/>
         <w:t>References</w:t>
       </w:r>
     </w:p>
     <w:p>
       <w:r>
-        <w:t xml:space="preserve">Gopher Industries 2026, </w:t>
-      </w:r>
-      <w:proofErr w:type="spellStart"/>
-      <w:r>
-        <w:t>NutriHelp</w:t>
-      </w:r>
-      <w:proofErr w:type="spellEnd"/>
-      <w:r>
-        <w:t xml:space="preserve"> Project Handover Document, Trimester 1, 2026, internal project document, Gopher Industries.</w:t>
-      </w:r>
-    </w:p>
-    <w:p>
-      <w:proofErr w:type="spellStart"/>
-      <w:r>
-        <w:t>NutriHelp</w:t>
-      </w:r>
-      <w:proofErr w:type="spellEnd"/>
-      <w:r>
-        <w:t xml:space="preserve"> Frontend Team 2026, </w:t>
-      </w:r>
-      <w:proofErr w:type="spellStart"/>
-      <w:r>
-        <w:t>NutriHelp</w:t>
-      </w:r>
-      <w:proofErr w:type="spellEnd"/>
-      <w:r>
-        <w:t xml:space="preserve"> Frontend Sprint 1 Detailed Task Breakdown, Trimester 2, 2026, internal project planning document, Gopher Industries.</w:t>
+        <w:t>Gopher Industries 2026, NutriHelp Project Handover Document, Trimester 1, 2026, internal project document, Gopher Industries.</w:t>
+      </w:r>
+    </w:p>
+    <w:p>
+      <w:r>
+        <w:t>NutriHelp Frontend Team 2026, NutriHelp Frontend Sprint 1 Detailed Task Breakdown, Trimester 2, 2026, internal project planning document, Gopher Industries.</w:t>
       </w:r>
     </w:p>
     <w:p/>
@@ -5902,7 +5188,7 @@
   <w:abstractNum w:abstractNumId="1" w15:restartNumberingAfterBreak="0">
     <w:nsid w:val="09471DA3"/>
     <w:multiLevelType w:val="hybridMultilevel"/>
-    <w:tmpl w:val="432A38C2"/>
+    <w:tmpl w:val="13E0ED08"/>
     <w:lvl w:ilvl="0" w:tplc="A04E665E">
       <w:start w:val="1"/>
       <w:numFmt w:val="bullet"/>
@@ -9293,7 +8579,6 @@
   <w:style w:type="character" w:default="1" w:styleId="DefaultParagraphFont">
     <w:name w:val="Default Paragraph Font"/>
     <w:uiPriority w:val="1"/>
-    <w:semiHidden/>
     <w:unhideWhenUsed/>
   </w:style>
   <w:style w:type="table" w:default="1" w:styleId="TableNormal">

</xml_diff>